<commit_message>
33 Gründe: Titel gekürzt, Copyright-Hinweis entfernt, engerer Zeilenabstand
Überschrift ohne "müssen!", Copyright-Hinweis am Ende entfernt, Stichpunkte
laufen jetzt als enge Gruppe ohne Leerzeile dazwischen für kleineren
Zeilenabstand.

Co-Authored-By: Claude Sonnet 5 <noreply@anthropic.com>
Claude-Session: https://claude.ai/code/session_01DeqSdBatYE6t9FA6GS9TPf
</commit_message>
<xml_diff>
--- a/vertrieb/Recognize-You-33-Gruende.docx
+++ b/vertrieb/Recognize-You-33-Gruende.docx
@@ -14,7 +14,7 @@
           <w:sz w:val="40"/>
           <w:szCs w:val="40"/>
         </w:rPr>
-        <w:t xml:space="preserve">33 Gründe: Warum neue Klienten bei mir kaufen müssen!</w:t>
+        <w:t xml:space="preserve">33 Gründe: Warum neue Klienten bei mir kaufen</w:t>
       </w:r>
     </w:p>
     <w:p>
@@ -59,19 +59,6 @@
     <w:p>
       <w:pPr>
         <w:spacing w:after="0" w:before="0"/>
-      </w:pPr>
-      <w:r>
-        <w:rPr>
-          <w:rFonts w:ascii="Calibri" w:cs="Calibri" w:eastAsia="Calibri" w:hAnsi="Calibri"/>
-          <w:sz w:val="22"/>
-          <w:szCs w:val="22"/>
-        </w:rPr>
-        <w:t xml:space="preserve"/>
-      </w:r>
-    </w:p>
-    <w:p>
-      <w:pPr>
-        <w:spacing w:after="0" w:before="0"/>
         <w:ind w:left="106"/>
       </w:pPr>
       <w:r>
@@ -98,19 +85,6 @@
     <w:p>
       <w:pPr>
         <w:spacing w:after="0" w:before="0"/>
-      </w:pPr>
-      <w:r>
-        <w:rPr>
-          <w:rFonts w:ascii="Calibri" w:cs="Calibri" w:eastAsia="Calibri" w:hAnsi="Calibri"/>
-          <w:sz w:val="22"/>
-          <w:szCs w:val="22"/>
-        </w:rPr>
-        <w:t xml:space="preserve"/>
-      </w:r>
-    </w:p>
-    <w:p>
-      <w:pPr>
-        <w:spacing w:after="0" w:before="0"/>
         <w:ind w:left="106"/>
       </w:pPr>
       <w:r>
@@ -137,19 +111,6 @@
     <w:p>
       <w:pPr>
         <w:spacing w:after="0" w:before="0"/>
-      </w:pPr>
-      <w:r>
-        <w:rPr>
-          <w:rFonts w:ascii="Calibri" w:cs="Calibri" w:eastAsia="Calibri" w:hAnsi="Calibri"/>
-          <w:sz w:val="22"/>
-          <w:szCs w:val="22"/>
-        </w:rPr>
-        <w:t xml:space="preserve"/>
-      </w:r>
-    </w:p>
-    <w:p>
-      <w:pPr>
-        <w:spacing w:after="0" w:before="0"/>
         <w:ind w:left="106"/>
       </w:pPr>
       <w:r>
@@ -176,19 +137,6 @@
     <w:p>
       <w:pPr>
         <w:spacing w:after="0" w:before="0"/>
-      </w:pPr>
-      <w:r>
-        <w:rPr>
-          <w:rFonts w:ascii="Calibri" w:cs="Calibri" w:eastAsia="Calibri" w:hAnsi="Calibri"/>
-          <w:sz w:val="22"/>
-          <w:szCs w:val="22"/>
-        </w:rPr>
-        <w:t xml:space="preserve"/>
-      </w:r>
-    </w:p>
-    <w:p>
-      <w:pPr>
-        <w:spacing w:after="0" w:before="0"/>
         <w:ind w:left="106"/>
       </w:pPr>
       <w:r>
@@ -215,19 +163,6 @@
     <w:p>
       <w:pPr>
         <w:spacing w:after="0" w:before="0"/>
-      </w:pPr>
-      <w:r>
-        <w:rPr>
-          <w:rFonts w:ascii="Calibri" w:cs="Calibri" w:eastAsia="Calibri" w:hAnsi="Calibri"/>
-          <w:sz w:val="22"/>
-          <w:szCs w:val="22"/>
-        </w:rPr>
-        <w:t xml:space="preserve"/>
-      </w:r>
-    </w:p>
-    <w:p>
-      <w:pPr>
-        <w:spacing w:after="0" w:before="0"/>
         <w:ind w:left="106"/>
       </w:pPr>
       <w:r>
@@ -254,19 +189,6 @@
     <w:p>
       <w:pPr>
         <w:spacing w:after="0" w:before="0"/>
-      </w:pPr>
-      <w:r>
-        <w:rPr>
-          <w:rFonts w:ascii="Calibri" w:cs="Calibri" w:eastAsia="Calibri" w:hAnsi="Calibri"/>
-          <w:sz w:val="22"/>
-          <w:szCs w:val="22"/>
-        </w:rPr>
-        <w:t xml:space="preserve"/>
-      </w:r>
-    </w:p>
-    <w:p>
-      <w:pPr>
-        <w:spacing w:after="0" w:before="0"/>
         <w:ind w:left="106"/>
       </w:pPr>
       <w:r>
@@ -293,19 +215,6 @@
     <w:p>
       <w:pPr>
         <w:spacing w:after="0" w:before="0"/>
-      </w:pPr>
-      <w:r>
-        <w:rPr>
-          <w:rFonts w:ascii="Calibri" w:cs="Calibri" w:eastAsia="Calibri" w:hAnsi="Calibri"/>
-          <w:sz w:val="22"/>
-          <w:szCs w:val="22"/>
-        </w:rPr>
-        <w:t xml:space="preserve"/>
-      </w:r>
-    </w:p>
-    <w:p>
-      <w:pPr>
-        <w:spacing w:after="0" w:before="0"/>
         <w:ind w:left="106"/>
       </w:pPr>
       <w:r>
@@ -332,19 +241,6 @@
     <w:p>
       <w:pPr>
         <w:spacing w:after="0" w:before="0"/>
-      </w:pPr>
-      <w:r>
-        <w:rPr>
-          <w:rFonts w:ascii="Calibri" w:cs="Calibri" w:eastAsia="Calibri" w:hAnsi="Calibri"/>
-          <w:sz w:val="22"/>
-          <w:szCs w:val="22"/>
-        </w:rPr>
-        <w:t xml:space="preserve"/>
-      </w:r>
-    </w:p>
-    <w:p>
-      <w:pPr>
-        <w:spacing w:after="0" w:before="0"/>
         <w:ind w:left="106"/>
       </w:pPr>
       <w:r>
@@ -371,19 +267,6 @@
     <w:p>
       <w:pPr>
         <w:spacing w:after="0" w:before="0"/>
-      </w:pPr>
-      <w:r>
-        <w:rPr>
-          <w:rFonts w:ascii="Calibri" w:cs="Calibri" w:eastAsia="Calibri" w:hAnsi="Calibri"/>
-          <w:sz w:val="22"/>
-          <w:szCs w:val="22"/>
-        </w:rPr>
-        <w:t xml:space="preserve"/>
-      </w:r>
-    </w:p>
-    <w:p>
-      <w:pPr>
-        <w:spacing w:after="0" w:before="0"/>
         <w:ind w:left="106"/>
       </w:pPr>
       <w:r>
@@ -410,19 +293,6 @@
     <w:p>
       <w:pPr>
         <w:spacing w:after="0" w:before="0"/>
-      </w:pPr>
-      <w:r>
-        <w:rPr>
-          <w:rFonts w:ascii="Calibri" w:cs="Calibri" w:eastAsia="Calibri" w:hAnsi="Calibri"/>
-          <w:sz w:val="22"/>
-          <w:szCs w:val="22"/>
-        </w:rPr>
-        <w:t xml:space="preserve"/>
-      </w:r>
-    </w:p>
-    <w:p>
-      <w:pPr>
-        <w:spacing w:after="0" w:before="0"/>
         <w:ind w:left="106"/>
       </w:pPr>
       <w:r>
@@ -449,19 +319,6 @@
     <w:p>
       <w:pPr>
         <w:spacing w:after="0" w:before="0"/>
-      </w:pPr>
-      <w:r>
-        <w:rPr>
-          <w:rFonts w:ascii="Calibri" w:cs="Calibri" w:eastAsia="Calibri" w:hAnsi="Calibri"/>
-          <w:sz w:val="22"/>
-          <w:szCs w:val="22"/>
-        </w:rPr>
-        <w:t xml:space="preserve"/>
-      </w:r>
-    </w:p>
-    <w:p>
-      <w:pPr>
-        <w:spacing w:after="0" w:before="0"/>
         <w:ind w:left="106"/>
       </w:pPr>
       <w:r>
@@ -488,19 +345,6 @@
     <w:p>
       <w:pPr>
         <w:spacing w:after="0" w:before="0"/>
-      </w:pPr>
-      <w:r>
-        <w:rPr>
-          <w:rFonts w:ascii="Calibri" w:cs="Calibri" w:eastAsia="Calibri" w:hAnsi="Calibri"/>
-          <w:sz w:val="22"/>
-          <w:szCs w:val="22"/>
-        </w:rPr>
-        <w:t xml:space="preserve"/>
-      </w:r>
-    </w:p>
-    <w:p>
-      <w:pPr>
-        <w:spacing w:after="0" w:before="0"/>
         <w:ind w:left="106"/>
       </w:pPr>
       <w:r>
@@ -527,19 +371,6 @@
     <w:p>
       <w:pPr>
         <w:spacing w:after="0" w:before="0"/>
-      </w:pPr>
-      <w:r>
-        <w:rPr>
-          <w:rFonts w:ascii="Calibri" w:cs="Calibri" w:eastAsia="Calibri" w:hAnsi="Calibri"/>
-          <w:sz w:val="22"/>
-          <w:szCs w:val="22"/>
-        </w:rPr>
-        <w:t xml:space="preserve"/>
-      </w:r>
-    </w:p>
-    <w:p>
-      <w:pPr>
-        <w:spacing w:after="0" w:before="0"/>
         <w:ind w:left="106"/>
       </w:pPr>
       <w:r>
@@ -566,19 +397,6 @@
     <w:p>
       <w:pPr>
         <w:spacing w:after="0" w:before="0"/>
-      </w:pPr>
-      <w:r>
-        <w:rPr>
-          <w:rFonts w:ascii="Calibri" w:cs="Calibri" w:eastAsia="Calibri" w:hAnsi="Calibri"/>
-          <w:sz w:val="22"/>
-          <w:szCs w:val="22"/>
-        </w:rPr>
-        <w:t xml:space="preserve"/>
-      </w:r>
-    </w:p>
-    <w:p>
-      <w:pPr>
-        <w:spacing w:after="0" w:before="0"/>
         <w:ind w:left="106"/>
       </w:pPr>
       <w:r>
@@ -605,19 +423,6 @@
     <w:p>
       <w:pPr>
         <w:spacing w:after="0" w:before="0"/>
-      </w:pPr>
-      <w:r>
-        <w:rPr>
-          <w:rFonts w:ascii="Calibri" w:cs="Calibri" w:eastAsia="Calibri" w:hAnsi="Calibri"/>
-          <w:sz w:val="22"/>
-          <w:szCs w:val="22"/>
-        </w:rPr>
-        <w:t xml:space="preserve"/>
-      </w:r>
-    </w:p>
-    <w:p>
-      <w:pPr>
-        <w:spacing w:after="0" w:before="0"/>
         <w:ind w:left="106"/>
       </w:pPr>
       <w:r>
@@ -644,19 +449,6 @@
     <w:p>
       <w:pPr>
         <w:spacing w:after="0" w:before="0"/>
-      </w:pPr>
-      <w:r>
-        <w:rPr>
-          <w:rFonts w:ascii="Calibri" w:cs="Calibri" w:eastAsia="Calibri" w:hAnsi="Calibri"/>
-          <w:sz w:val="22"/>
-          <w:szCs w:val="22"/>
-        </w:rPr>
-        <w:t xml:space="preserve"/>
-      </w:r>
-    </w:p>
-    <w:p>
-      <w:pPr>
-        <w:spacing w:after="0" w:before="0"/>
         <w:ind w:left="106"/>
       </w:pPr>
       <w:r>
@@ -683,19 +475,6 @@
     <w:p>
       <w:pPr>
         <w:spacing w:after="0" w:before="0"/>
-      </w:pPr>
-      <w:r>
-        <w:rPr>
-          <w:rFonts w:ascii="Calibri" w:cs="Calibri" w:eastAsia="Calibri" w:hAnsi="Calibri"/>
-          <w:sz w:val="22"/>
-          <w:szCs w:val="22"/>
-        </w:rPr>
-        <w:t xml:space="preserve"/>
-      </w:r>
-    </w:p>
-    <w:p>
-      <w:pPr>
-        <w:spacing w:after="0" w:before="0"/>
         <w:ind w:left="106"/>
       </w:pPr>
       <w:r>
@@ -722,19 +501,6 @@
     <w:p>
       <w:pPr>
         <w:spacing w:after="0" w:before="0"/>
-      </w:pPr>
-      <w:r>
-        <w:rPr>
-          <w:rFonts w:ascii="Calibri" w:cs="Calibri" w:eastAsia="Calibri" w:hAnsi="Calibri"/>
-          <w:sz w:val="22"/>
-          <w:szCs w:val="22"/>
-        </w:rPr>
-        <w:t xml:space="preserve"/>
-      </w:r>
-    </w:p>
-    <w:p>
-      <w:pPr>
-        <w:spacing w:after="0" w:before="0"/>
         <w:ind w:left="106"/>
       </w:pPr>
       <w:r>
@@ -761,19 +527,6 @@
     <w:p>
       <w:pPr>
         <w:spacing w:after="0" w:before="0"/>
-      </w:pPr>
-      <w:r>
-        <w:rPr>
-          <w:rFonts w:ascii="Calibri" w:cs="Calibri" w:eastAsia="Calibri" w:hAnsi="Calibri"/>
-          <w:sz w:val="22"/>
-          <w:szCs w:val="22"/>
-        </w:rPr>
-        <w:t xml:space="preserve"/>
-      </w:r>
-    </w:p>
-    <w:p>
-      <w:pPr>
-        <w:spacing w:after="0" w:before="0"/>
         <w:ind w:left="106"/>
       </w:pPr>
       <w:r>
@@ -800,19 +553,6 @@
     <w:p>
       <w:pPr>
         <w:spacing w:after="0" w:before="0"/>
-      </w:pPr>
-      <w:r>
-        <w:rPr>
-          <w:rFonts w:ascii="Calibri" w:cs="Calibri" w:eastAsia="Calibri" w:hAnsi="Calibri"/>
-          <w:sz w:val="22"/>
-          <w:szCs w:val="22"/>
-        </w:rPr>
-        <w:t xml:space="preserve"/>
-      </w:r>
-    </w:p>
-    <w:p>
-      <w:pPr>
-        <w:spacing w:after="0" w:before="0"/>
         <w:ind w:left="106"/>
       </w:pPr>
       <w:r>
@@ -839,19 +579,6 @@
     <w:p>
       <w:pPr>
         <w:spacing w:after="0" w:before="0"/>
-      </w:pPr>
-      <w:r>
-        <w:rPr>
-          <w:rFonts w:ascii="Calibri" w:cs="Calibri" w:eastAsia="Calibri" w:hAnsi="Calibri"/>
-          <w:sz w:val="22"/>
-          <w:szCs w:val="22"/>
-        </w:rPr>
-        <w:t xml:space="preserve"/>
-      </w:r>
-    </w:p>
-    <w:p>
-      <w:pPr>
-        <w:spacing w:after="0" w:before="0"/>
         <w:ind w:left="106"/>
       </w:pPr>
       <w:r>
@@ -878,19 +605,6 @@
     <w:p>
       <w:pPr>
         <w:spacing w:after="0" w:before="0"/>
-      </w:pPr>
-      <w:r>
-        <w:rPr>
-          <w:rFonts w:ascii="Calibri" w:cs="Calibri" w:eastAsia="Calibri" w:hAnsi="Calibri"/>
-          <w:sz w:val="22"/>
-          <w:szCs w:val="22"/>
-        </w:rPr>
-        <w:t xml:space="preserve"/>
-      </w:r>
-    </w:p>
-    <w:p>
-      <w:pPr>
-        <w:spacing w:after="0" w:before="0"/>
         <w:ind w:left="106"/>
       </w:pPr>
       <w:r>
@@ -917,19 +631,6 @@
     <w:p>
       <w:pPr>
         <w:spacing w:after="0" w:before="0"/>
-      </w:pPr>
-      <w:r>
-        <w:rPr>
-          <w:rFonts w:ascii="Calibri" w:cs="Calibri" w:eastAsia="Calibri" w:hAnsi="Calibri"/>
-          <w:sz w:val="22"/>
-          <w:szCs w:val="22"/>
-        </w:rPr>
-        <w:t xml:space="preserve"/>
-      </w:r>
-    </w:p>
-    <w:p>
-      <w:pPr>
-        <w:spacing w:after="0" w:before="0"/>
         <w:ind w:left="106"/>
       </w:pPr>
       <w:r>
@@ -956,19 +657,6 @@
     <w:p>
       <w:pPr>
         <w:spacing w:after="0" w:before="0"/>
-      </w:pPr>
-      <w:r>
-        <w:rPr>
-          <w:rFonts w:ascii="Calibri" w:cs="Calibri" w:eastAsia="Calibri" w:hAnsi="Calibri"/>
-          <w:sz w:val="22"/>
-          <w:szCs w:val="22"/>
-        </w:rPr>
-        <w:t xml:space="preserve"/>
-      </w:r>
-    </w:p>
-    <w:p>
-      <w:pPr>
-        <w:spacing w:after="0" w:before="0"/>
         <w:ind w:left="106"/>
       </w:pPr>
       <w:r>
@@ -995,19 +683,6 @@
     <w:p>
       <w:pPr>
         <w:spacing w:after="0" w:before="0"/>
-      </w:pPr>
-      <w:r>
-        <w:rPr>
-          <w:rFonts w:ascii="Calibri" w:cs="Calibri" w:eastAsia="Calibri" w:hAnsi="Calibri"/>
-          <w:sz w:val="22"/>
-          <w:szCs w:val="22"/>
-        </w:rPr>
-        <w:t xml:space="preserve"/>
-      </w:r>
-    </w:p>
-    <w:p>
-      <w:pPr>
-        <w:spacing w:after="0" w:before="0"/>
         <w:ind w:left="106"/>
       </w:pPr>
       <w:r>
@@ -1034,19 +709,6 @@
     <w:p>
       <w:pPr>
         <w:spacing w:after="0" w:before="0"/>
-      </w:pPr>
-      <w:r>
-        <w:rPr>
-          <w:rFonts w:ascii="Calibri" w:cs="Calibri" w:eastAsia="Calibri" w:hAnsi="Calibri"/>
-          <w:sz w:val="22"/>
-          <w:szCs w:val="22"/>
-        </w:rPr>
-        <w:t xml:space="preserve"/>
-      </w:r>
-    </w:p>
-    <w:p>
-      <w:pPr>
-        <w:spacing w:after="0" w:before="0"/>
         <w:ind w:left="106"/>
       </w:pPr>
       <w:r>
@@ -1073,19 +735,6 @@
     <w:p>
       <w:pPr>
         <w:spacing w:after="0" w:before="0"/>
-      </w:pPr>
-      <w:r>
-        <w:rPr>
-          <w:rFonts w:ascii="Calibri" w:cs="Calibri" w:eastAsia="Calibri" w:hAnsi="Calibri"/>
-          <w:sz w:val="22"/>
-          <w:szCs w:val="22"/>
-        </w:rPr>
-        <w:t xml:space="preserve"/>
-      </w:r>
-    </w:p>
-    <w:p>
-      <w:pPr>
-        <w:spacing w:after="0" w:before="0"/>
         <w:ind w:left="106"/>
       </w:pPr>
       <w:r>
@@ -1112,19 +761,6 @@
     <w:p>
       <w:pPr>
         <w:spacing w:after="0" w:before="0"/>
-      </w:pPr>
-      <w:r>
-        <w:rPr>
-          <w:rFonts w:ascii="Calibri" w:cs="Calibri" w:eastAsia="Calibri" w:hAnsi="Calibri"/>
-          <w:sz w:val="22"/>
-          <w:szCs w:val="22"/>
-        </w:rPr>
-        <w:t xml:space="preserve"/>
-      </w:r>
-    </w:p>
-    <w:p>
-      <w:pPr>
-        <w:spacing w:after="0" w:before="0"/>
         <w:ind w:left="106"/>
       </w:pPr>
       <w:r>
@@ -1151,19 +787,6 @@
     <w:p>
       <w:pPr>
         <w:spacing w:after="0" w:before="0"/>
-      </w:pPr>
-      <w:r>
-        <w:rPr>
-          <w:rFonts w:ascii="Calibri" w:cs="Calibri" w:eastAsia="Calibri" w:hAnsi="Calibri"/>
-          <w:sz w:val="22"/>
-          <w:szCs w:val="22"/>
-        </w:rPr>
-        <w:t xml:space="preserve"/>
-      </w:r>
-    </w:p>
-    <w:p>
-      <w:pPr>
-        <w:spacing w:after="0" w:before="0"/>
         <w:ind w:left="106"/>
       </w:pPr>
       <w:r>
@@ -1190,19 +813,6 @@
     <w:p>
       <w:pPr>
         <w:spacing w:after="0" w:before="0"/>
-      </w:pPr>
-      <w:r>
-        <w:rPr>
-          <w:rFonts w:ascii="Calibri" w:cs="Calibri" w:eastAsia="Calibri" w:hAnsi="Calibri"/>
-          <w:sz w:val="22"/>
-          <w:szCs w:val="22"/>
-        </w:rPr>
-        <w:t xml:space="preserve"/>
-      </w:r>
-    </w:p>
-    <w:p>
-      <w:pPr>
-        <w:spacing w:after="0" w:before="0"/>
         <w:ind w:left="106"/>
       </w:pPr>
       <w:r>
@@ -1229,19 +839,6 @@
     <w:p>
       <w:pPr>
         <w:spacing w:after="0" w:before="0"/>
-      </w:pPr>
-      <w:r>
-        <w:rPr>
-          <w:rFonts w:ascii="Calibri" w:cs="Calibri" w:eastAsia="Calibri" w:hAnsi="Calibri"/>
-          <w:sz w:val="22"/>
-          <w:szCs w:val="22"/>
-        </w:rPr>
-        <w:t xml:space="preserve"/>
-      </w:r>
-    </w:p>
-    <w:p>
-      <w:pPr>
-        <w:spacing w:after="0" w:before="0"/>
         <w:ind w:left="106"/>
       </w:pPr>
       <w:r>
@@ -1268,19 +865,6 @@
     <w:p>
       <w:pPr>
         <w:spacing w:after="0" w:before="0"/>
-      </w:pPr>
-      <w:r>
-        <w:rPr>
-          <w:rFonts w:ascii="Calibri" w:cs="Calibri" w:eastAsia="Calibri" w:hAnsi="Calibri"/>
-          <w:sz w:val="22"/>
-          <w:szCs w:val="22"/>
-        </w:rPr>
-        <w:t xml:space="preserve"/>
-      </w:r>
-    </w:p>
-    <w:p>
-      <w:pPr>
-        <w:spacing w:after="0" w:before="0"/>
         <w:ind w:left="106"/>
       </w:pPr>
       <w:r>
@@ -1302,37 +886,6 @@
           <w:szCs w:val="22"/>
         </w:rPr>
         <w:t xml:space="preserve">Weil ich eine glasklare Vorstellung von der Zusammenarbeit habe und dadurch stets direkt und ehrlich zu dem Klient bin, auch wenn es ihm erstmal nicht gefällt</w:t>
-      </w:r>
-    </w:p>
-    <w:p>
-      <w:pPr>
-        <w:spacing w:after="0" w:before="0"/>
-      </w:pPr>
-      <w:r>
-        <w:rPr>
-          <w:rFonts w:ascii="Calibri" w:cs="Calibri" w:eastAsia="Calibri" w:hAnsi="Calibri"/>
-          <w:sz w:val="22"/>
-          <w:szCs w:val="22"/>
-        </w:rPr>
-        <w:t xml:space="preserve"/>
-      </w:r>
-    </w:p>
-    <w:p>
-      <w:pPr>
-        <w:spacing w:after="0" w:before="0"/>
-        <w:ind w:left="300"/>
-      </w:pPr>
-      <w:r>
-        <w:rPr>
-          <w:rFonts w:ascii="Calibri" w:cs="Calibri" w:eastAsia="Calibri" w:hAnsi="Calibri"/>
-          <w:b w:val="false"/>
-          <w:bCs w:val="false"/>
-          <w:i/>
-          <w:iCs/>
-          <w:sz w:val="19"/>
-          <w:szCs w:val="19"/>
-        </w:rPr>
-        <w:t xml:space="preserve">© Kevin Kowsky, alle Rechte vorbehalten. Nachdruck, Kopieren oder Reproduzieren, auch auszugsweise, in jeglicher Form ohne ausdrückliche schriftliche Genehmigung des Urhebers untersagt. Alle Übersetzungsrechte vorbehalten.</w:t>
       </w:r>
     </w:p>
     <w:sectPr>

</xml_diff>

<commit_message>
33 Gründe: kleiner Abstand zwischen den Stichpunkten statt keinem
bullet() unterstützt jetzt optional spacingAfter für einen kleinen Absatz-
abstand, Standardwert (0) bleibt für alle anderen Dokumente unverändert. Im
33-Gründe-Dokument sorgt das für einen kleinen, gut lesbaren Abstand zwischen
den Punkten statt gar keinem.

Co-Authored-By: Claude Sonnet 5 <noreply@anthropic.com>
Claude-Session: https://claude.ai/code/session_01DeqSdBatYE6t9FA6GS9TPf
</commit_message>
<xml_diff>
--- a/vertrieb/Recognize-You-33-Gruende.docx
+++ b/vertrieb/Recognize-You-33-Gruende.docx
@@ -32,7 +32,7 @@
     </w:p>
     <w:p>
       <w:pPr>
-        <w:spacing w:after="0" w:before="0"/>
+        <w:spacing w:after="120" w:before="0"/>
         <w:ind w:left="106"/>
       </w:pPr>
       <w:r>
@@ -58,7 +58,7 @@
     </w:p>
     <w:p>
       <w:pPr>
-        <w:spacing w:after="0" w:before="0"/>
+        <w:spacing w:after="120" w:before="0"/>
         <w:ind w:left="106"/>
       </w:pPr>
       <w:r>
@@ -84,7 +84,7 @@
     </w:p>
     <w:p>
       <w:pPr>
-        <w:spacing w:after="0" w:before="0"/>
+        <w:spacing w:after="120" w:before="0"/>
         <w:ind w:left="106"/>
       </w:pPr>
       <w:r>
@@ -110,7 +110,7 @@
     </w:p>
     <w:p>
       <w:pPr>
-        <w:spacing w:after="0" w:before="0"/>
+        <w:spacing w:after="120" w:before="0"/>
         <w:ind w:left="106"/>
       </w:pPr>
       <w:r>
@@ -136,7 +136,7 @@
     </w:p>
     <w:p>
       <w:pPr>
-        <w:spacing w:after="0" w:before="0"/>
+        <w:spacing w:after="120" w:before="0"/>
         <w:ind w:left="106"/>
       </w:pPr>
       <w:r>
@@ -162,7 +162,7 @@
     </w:p>
     <w:p>
       <w:pPr>
-        <w:spacing w:after="0" w:before="0"/>
+        <w:spacing w:after="120" w:before="0"/>
         <w:ind w:left="106"/>
       </w:pPr>
       <w:r>
@@ -188,7 +188,7 @@
     </w:p>
     <w:p>
       <w:pPr>
-        <w:spacing w:after="0" w:before="0"/>
+        <w:spacing w:after="120" w:before="0"/>
         <w:ind w:left="106"/>
       </w:pPr>
       <w:r>
@@ -214,7 +214,7 @@
     </w:p>
     <w:p>
       <w:pPr>
-        <w:spacing w:after="0" w:before="0"/>
+        <w:spacing w:after="120" w:before="0"/>
         <w:ind w:left="106"/>
       </w:pPr>
       <w:r>
@@ -240,7 +240,7 @@
     </w:p>
     <w:p>
       <w:pPr>
-        <w:spacing w:after="0" w:before="0"/>
+        <w:spacing w:after="120" w:before="0"/>
         <w:ind w:left="106"/>
       </w:pPr>
       <w:r>
@@ -266,7 +266,7 @@
     </w:p>
     <w:p>
       <w:pPr>
-        <w:spacing w:after="0" w:before="0"/>
+        <w:spacing w:after="120" w:before="0"/>
         <w:ind w:left="106"/>
       </w:pPr>
       <w:r>
@@ -292,7 +292,7 @@
     </w:p>
     <w:p>
       <w:pPr>
-        <w:spacing w:after="0" w:before="0"/>
+        <w:spacing w:after="120" w:before="0"/>
         <w:ind w:left="106"/>
       </w:pPr>
       <w:r>
@@ -318,7 +318,7 @@
     </w:p>
     <w:p>
       <w:pPr>
-        <w:spacing w:after="0" w:before="0"/>
+        <w:spacing w:after="120" w:before="0"/>
         <w:ind w:left="106"/>
       </w:pPr>
       <w:r>
@@ -344,7 +344,7 @@
     </w:p>
     <w:p>
       <w:pPr>
-        <w:spacing w:after="0" w:before="0"/>
+        <w:spacing w:after="120" w:before="0"/>
         <w:ind w:left="106"/>
       </w:pPr>
       <w:r>
@@ -370,7 +370,7 @@
     </w:p>
     <w:p>
       <w:pPr>
-        <w:spacing w:after="0" w:before="0"/>
+        <w:spacing w:after="120" w:before="0"/>
         <w:ind w:left="106"/>
       </w:pPr>
       <w:r>
@@ -396,7 +396,7 @@
     </w:p>
     <w:p>
       <w:pPr>
-        <w:spacing w:after="0" w:before="0"/>
+        <w:spacing w:after="120" w:before="0"/>
         <w:ind w:left="106"/>
       </w:pPr>
       <w:r>
@@ -422,7 +422,7 @@
     </w:p>
     <w:p>
       <w:pPr>
-        <w:spacing w:after="0" w:before="0"/>
+        <w:spacing w:after="120" w:before="0"/>
         <w:ind w:left="106"/>
       </w:pPr>
       <w:r>
@@ -448,7 +448,7 @@
     </w:p>
     <w:p>
       <w:pPr>
-        <w:spacing w:after="0" w:before="0"/>
+        <w:spacing w:after="120" w:before="0"/>
         <w:ind w:left="106"/>
       </w:pPr>
       <w:r>
@@ -474,7 +474,7 @@
     </w:p>
     <w:p>
       <w:pPr>
-        <w:spacing w:after="0" w:before="0"/>
+        <w:spacing w:after="120" w:before="0"/>
         <w:ind w:left="106"/>
       </w:pPr>
       <w:r>
@@ -500,7 +500,7 @@
     </w:p>
     <w:p>
       <w:pPr>
-        <w:spacing w:after="0" w:before="0"/>
+        <w:spacing w:after="120" w:before="0"/>
         <w:ind w:left="106"/>
       </w:pPr>
       <w:r>
@@ -526,7 +526,7 @@
     </w:p>
     <w:p>
       <w:pPr>
-        <w:spacing w:after="0" w:before="0"/>
+        <w:spacing w:after="120" w:before="0"/>
         <w:ind w:left="106"/>
       </w:pPr>
       <w:r>
@@ -552,7 +552,7 @@
     </w:p>
     <w:p>
       <w:pPr>
-        <w:spacing w:after="0" w:before="0"/>
+        <w:spacing w:after="120" w:before="0"/>
         <w:ind w:left="106"/>
       </w:pPr>
       <w:r>
@@ -578,7 +578,7 @@
     </w:p>
     <w:p>
       <w:pPr>
-        <w:spacing w:after="0" w:before="0"/>
+        <w:spacing w:after="120" w:before="0"/>
         <w:ind w:left="106"/>
       </w:pPr>
       <w:r>
@@ -604,7 +604,7 @@
     </w:p>
     <w:p>
       <w:pPr>
-        <w:spacing w:after="0" w:before="0"/>
+        <w:spacing w:after="120" w:before="0"/>
         <w:ind w:left="106"/>
       </w:pPr>
       <w:r>
@@ -630,7 +630,7 @@
     </w:p>
     <w:p>
       <w:pPr>
-        <w:spacing w:after="0" w:before="0"/>
+        <w:spacing w:after="120" w:before="0"/>
         <w:ind w:left="106"/>
       </w:pPr>
       <w:r>
@@ -656,7 +656,7 @@
     </w:p>
     <w:p>
       <w:pPr>
-        <w:spacing w:after="0" w:before="0"/>
+        <w:spacing w:after="120" w:before="0"/>
         <w:ind w:left="106"/>
       </w:pPr>
       <w:r>
@@ -682,7 +682,7 @@
     </w:p>
     <w:p>
       <w:pPr>
-        <w:spacing w:after="0" w:before="0"/>
+        <w:spacing w:after="120" w:before="0"/>
         <w:ind w:left="106"/>
       </w:pPr>
       <w:r>
@@ -708,7 +708,7 @@
     </w:p>
     <w:p>
       <w:pPr>
-        <w:spacing w:after="0" w:before="0"/>
+        <w:spacing w:after="120" w:before="0"/>
         <w:ind w:left="106"/>
       </w:pPr>
       <w:r>
@@ -734,7 +734,7 @@
     </w:p>
     <w:p>
       <w:pPr>
-        <w:spacing w:after="0" w:before="0"/>
+        <w:spacing w:after="120" w:before="0"/>
         <w:ind w:left="106"/>
       </w:pPr>
       <w:r>
@@ -760,7 +760,7 @@
     </w:p>
     <w:p>
       <w:pPr>
-        <w:spacing w:after="0" w:before="0"/>
+        <w:spacing w:after="120" w:before="0"/>
         <w:ind w:left="106"/>
       </w:pPr>
       <w:r>
@@ -786,7 +786,7 @@
     </w:p>
     <w:p>
       <w:pPr>
-        <w:spacing w:after="0" w:before="0"/>
+        <w:spacing w:after="120" w:before="0"/>
         <w:ind w:left="106"/>
       </w:pPr>
       <w:r>
@@ -812,7 +812,7 @@
     </w:p>
     <w:p>
       <w:pPr>
-        <w:spacing w:after="0" w:before="0"/>
+        <w:spacing w:after="120" w:before="0"/>
         <w:ind w:left="106"/>
       </w:pPr>
       <w:r>
@@ -838,7 +838,7 @@
     </w:p>
     <w:p>
       <w:pPr>
-        <w:spacing w:after="0" w:before="0"/>
+        <w:spacing w:after="120" w:before="0"/>
         <w:ind w:left="106"/>
       </w:pPr>
       <w:r>
@@ -864,7 +864,7 @@
     </w:p>
     <w:p>
       <w:pPr>
-        <w:spacing w:after="0" w:before="0"/>
+        <w:spacing w:after="120" w:before="0"/>
         <w:ind w:left="106"/>
       </w:pPr>
       <w:r>

</xml_diff>

<commit_message>
33 Gründe: Abstände exakt aus dem Original-PDF übernommen
Abstand Überschrift zu erstem Stichpunkt (28,8pt) und Abstand zwischen den
Stichpunkten (3,1pt) per PyMuPDF aus dem originalen, von Kevin hochgeladenen
PDF vermessen und in diesem Dokument exakt übernommen. title() unterstützt
jetzt ebenfalls ein optionales spacingAfter, Standardwert (0) bleibt für alle
anderen Dokumente unverändert.

Co-Authored-By: Claude Sonnet 5 <noreply@anthropic.com>
Claude-Session: https://claude.ai/code/session_01DeqSdBatYE6t9FA6GS9TPf
</commit_message>
<xml_diff>
--- a/vertrieb/Recognize-You-33-Gruende.docx
+++ b/vertrieb/Recognize-You-33-Gruende.docx
@@ -4,7 +4,7 @@
   <w:body>
     <w:p>
       <w:pPr>
-        <w:spacing w:after="0" w:before="0"/>
+        <w:spacing w:after="576" w:before="0"/>
       </w:pPr>
       <w:r>
         <w:rPr>
@@ -19,20 +19,7 @@
     </w:p>
     <w:p>
       <w:pPr>
-        <w:spacing w:after="0" w:before="0"/>
-      </w:pPr>
-      <w:r>
-        <w:rPr>
-          <w:rFonts w:ascii="Calibri" w:cs="Calibri" w:eastAsia="Calibri" w:hAnsi="Calibri"/>
-          <w:sz w:val="22"/>
-          <w:szCs w:val="22"/>
-        </w:rPr>
-        <w:t xml:space="preserve"/>
-      </w:r>
-    </w:p>
-    <w:p>
-      <w:pPr>
-        <w:spacing w:after="120" w:before="0"/>
+        <w:spacing w:after="62" w:before="0"/>
         <w:ind w:left="106"/>
       </w:pPr>
       <w:r>
@@ -58,7 +45,7 @@
     </w:p>
     <w:p>
       <w:pPr>
-        <w:spacing w:after="120" w:before="0"/>
+        <w:spacing w:after="62" w:before="0"/>
         <w:ind w:left="106"/>
       </w:pPr>
       <w:r>
@@ -84,7 +71,7 @@
     </w:p>
     <w:p>
       <w:pPr>
-        <w:spacing w:after="120" w:before="0"/>
+        <w:spacing w:after="62" w:before="0"/>
         <w:ind w:left="106"/>
       </w:pPr>
       <w:r>
@@ -110,7 +97,7 @@
     </w:p>
     <w:p>
       <w:pPr>
-        <w:spacing w:after="120" w:before="0"/>
+        <w:spacing w:after="62" w:before="0"/>
         <w:ind w:left="106"/>
       </w:pPr>
       <w:r>
@@ -136,7 +123,7 @@
     </w:p>
     <w:p>
       <w:pPr>
-        <w:spacing w:after="120" w:before="0"/>
+        <w:spacing w:after="62" w:before="0"/>
         <w:ind w:left="106"/>
       </w:pPr>
       <w:r>
@@ -162,7 +149,7 @@
     </w:p>
     <w:p>
       <w:pPr>
-        <w:spacing w:after="120" w:before="0"/>
+        <w:spacing w:after="62" w:before="0"/>
         <w:ind w:left="106"/>
       </w:pPr>
       <w:r>
@@ -188,7 +175,7 @@
     </w:p>
     <w:p>
       <w:pPr>
-        <w:spacing w:after="120" w:before="0"/>
+        <w:spacing w:after="62" w:before="0"/>
         <w:ind w:left="106"/>
       </w:pPr>
       <w:r>
@@ -214,7 +201,7 @@
     </w:p>
     <w:p>
       <w:pPr>
-        <w:spacing w:after="120" w:before="0"/>
+        <w:spacing w:after="62" w:before="0"/>
         <w:ind w:left="106"/>
       </w:pPr>
       <w:r>
@@ -240,7 +227,7 @@
     </w:p>
     <w:p>
       <w:pPr>
-        <w:spacing w:after="120" w:before="0"/>
+        <w:spacing w:after="62" w:before="0"/>
         <w:ind w:left="106"/>
       </w:pPr>
       <w:r>
@@ -266,7 +253,7 @@
     </w:p>
     <w:p>
       <w:pPr>
-        <w:spacing w:after="120" w:before="0"/>
+        <w:spacing w:after="62" w:before="0"/>
         <w:ind w:left="106"/>
       </w:pPr>
       <w:r>
@@ -292,7 +279,7 @@
     </w:p>
     <w:p>
       <w:pPr>
-        <w:spacing w:after="120" w:before="0"/>
+        <w:spacing w:after="62" w:before="0"/>
         <w:ind w:left="106"/>
       </w:pPr>
       <w:r>
@@ -318,7 +305,7 @@
     </w:p>
     <w:p>
       <w:pPr>
-        <w:spacing w:after="120" w:before="0"/>
+        <w:spacing w:after="62" w:before="0"/>
         <w:ind w:left="106"/>
       </w:pPr>
       <w:r>
@@ -344,7 +331,7 @@
     </w:p>
     <w:p>
       <w:pPr>
-        <w:spacing w:after="120" w:before="0"/>
+        <w:spacing w:after="62" w:before="0"/>
         <w:ind w:left="106"/>
       </w:pPr>
       <w:r>
@@ -370,7 +357,7 @@
     </w:p>
     <w:p>
       <w:pPr>
-        <w:spacing w:after="120" w:before="0"/>
+        <w:spacing w:after="62" w:before="0"/>
         <w:ind w:left="106"/>
       </w:pPr>
       <w:r>
@@ -396,7 +383,7 @@
     </w:p>
     <w:p>
       <w:pPr>
-        <w:spacing w:after="120" w:before="0"/>
+        <w:spacing w:after="62" w:before="0"/>
         <w:ind w:left="106"/>
       </w:pPr>
       <w:r>
@@ -422,7 +409,7 @@
     </w:p>
     <w:p>
       <w:pPr>
-        <w:spacing w:after="120" w:before="0"/>
+        <w:spacing w:after="62" w:before="0"/>
         <w:ind w:left="106"/>
       </w:pPr>
       <w:r>
@@ -448,7 +435,7 @@
     </w:p>
     <w:p>
       <w:pPr>
-        <w:spacing w:after="120" w:before="0"/>
+        <w:spacing w:after="62" w:before="0"/>
         <w:ind w:left="106"/>
       </w:pPr>
       <w:r>
@@ -474,7 +461,7 @@
     </w:p>
     <w:p>
       <w:pPr>
-        <w:spacing w:after="120" w:before="0"/>
+        <w:spacing w:after="62" w:before="0"/>
         <w:ind w:left="106"/>
       </w:pPr>
       <w:r>
@@ -500,7 +487,7 @@
     </w:p>
     <w:p>
       <w:pPr>
-        <w:spacing w:after="120" w:before="0"/>
+        <w:spacing w:after="62" w:before="0"/>
         <w:ind w:left="106"/>
       </w:pPr>
       <w:r>
@@ -526,7 +513,7 @@
     </w:p>
     <w:p>
       <w:pPr>
-        <w:spacing w:after="120" w:before="0"/>
+        <w:spacing w:after="62" w:before="0"/>
         <w:ind w:left="106"/>
       </w:pPr>
       <w:r>
@@ -552,7 +539,7 @@
     </w:p>
     <w:p>
       <w:pPr>
-        <w:spacing w:after="120" w:before="0"/>
+        <w:spacing w:after="62" w:before="0"/>
         <w:ind w:left="106"/>
       </w:pPr>
       <w:r>
@@ -578,7 +565,7 @@
     </w:p>
     <w:p>
       <w:pPr>
-        <w:spacing w:after="120" w:before="0"/>
+        <w:spacing w:after="62" w:before="0"/>
         <w:ind w:left="106"/>
       </w:pPr>
       <w:r>
@@ -604,7 +591,7 @@
     </w:p>
     <w:p>
       <w:pPr>
-        <w:spacing w:after="120" w:before="0"/>
+        <w:spacing w:after="62" w:before="0"/>
         <w:ind w:left="106"/>
       </w:pPr>
       <w:r>
@@ -630,7 +617,7 @@
     </w:p>
     <w:p>
       <w:pPr>
-        <w:spacing w:after="120" w:before="0"/>
+        <w:spacing w:after="62" w:before="0"/>
         <w:ind w:left="106"/>
       </w:pPr>
       <w:r>
@@ -656,7 +643,7 @@
     </w:p>
     <w:p>
       <w:pPr>
-        <w:spacing w:after="120" w:before="0"/>
+        <w:spacing w:after="62" w:before="0"/>
         <w:ind w:left="106"/>
       </w:pPr>
       <w:r>
@@ -682,7 +669,7 @@
     </w:p>
     <w:p>
       <w:pPr>
-        <w:spacing w:after="120" w:before="0"/>
+        <w:spacing w:after="62" w:before="0"/>
         <w:ind w:left="106"/>
       </w:pPr>
       <w:r>
@@ -708,7 +695,7 @@
     </w:p>
     <w:p>
       <w:pPr>
-        <w:spacing w:after="120" w:before="0"/>
+        <w:spacing w:after="62" w:before="0"/>
         <w:ind w:left="106"/>
       </w:pPr>
       <w:r>
@@ -734,7 +721,7 @@
     </w:p>
     <w:p>
       <w:pPr>
-        <w:spacing w:after="120" w:before="0"/>
+        <w:spacing w:after="62" w:before="0"/>
         <w:ind w:left="106"/>
       </w:pPr>
       <w:r>
@@ -760,7 +747,7 @@
     </w:p>
     <w:p>
       <w:pPr>
-        <w:spacing w:after="120" w:before="0"/>
+        <w:spacing w:after="62" w:before="0"/>
         <w:ind w:left="106"/>
       </w:pPr>
       <w:r>
@@ -786,7 +773,7 @@
     </w:p>
     <w:p>
       <w:pPr>
-        <w:spacing w:after="120" w:before="0"/>
+        <w:spacing w:after="62" w:before="0"/>
         <w:ind w:left="106"/>
       </w:pPr>
       <w:r>
@@ -812,7 +799,7 @@
     </w:p>
     <w:p>
       <w:pPr>
-        <w:spacing w:after="120" w:before="0"/>
+        <w:spacing w:after="62" w:before="0"/>
         <w:ind w:left="106"/>
       </w:pPr>
       <w:r>
@@ -838,7 +825,7 @@
     </w:p>
     <w:p>
       <w:pPr>
-        <w:spacing w:after="120" w:before="0"/>
+        <w:spacing w:after="62" w:before="0"/>
         <w:ind w:left="106"/>
       </w:pPr>
       <w:r>
@@ -864,7 +851,7 @@
     </w:p>
     <w:p>
       <w:pPr>
-        <w:spacing w:after="120" w:before="0"/>
+        <w:spacing w:after="62" w:before="0"/>
         <w:ind w:left="106"/>
       </w:pPr>
       <w:r>

</xml_diff>